<commit_message>
docs(report): add Saturday October 24 2026 weekly engineering progress report
</commit_message>
<xml_diff>
--- a/ZimMarket_Weekly_Progress_Report.docx
+++ b/ZimMarket_Weekly_Progress_Report.docx
@@ -33,7 +33,7 @@
           <w:sz w:val="22"/>
           <w:szCs w:val="22"/>
         </w:rPr>
-        <w:t xml:space="preserve">Saturday, 17 October 2026  •  ZimMarket &amp; Enterprise IT Asset Management System</w:t>
+        <w:t xml:space="preserve">Saturday, 24 October 2026  •  ZimMarket &amp; Enterprise IT Asset Management System</w:t>
       </w:r>
     </w:p>
     <w:p>
@@ -64,7 +64,7 @@
           <w:sz w:val="21"/>
           <w:szCs w:val="21"/>
         </w:rPr>
-        <w:t xml:space="preserve">This weekly engineering report details the software architecture, design overhauls, core technical deliverables, and visual hardening completed during the development sprint ending Saturday, 17 October 2026. Significant cross-platform advancements were delivered across both the ZimMarket peer-to-peer e-commerce ecosystem and the Enterprise IT Asset Management System:</w:t>
+        <w:t xml:space="preserve">This weekly engineering report presents the technical accomplishments, security enhancements, architectural hardening, and user experience milestones delivered during the development sprint ending Saturday, 24 October 2026. Across both the ZimMarket peer-to-peer e-commerce ecosystem and the Enterprise IT Asset Management System, engineering efforts focused on mission-critical security boundaries, zero-trust financial escrow guarantees, advanced discovery interfaces, and enterprise multi-branch organizational hierarchy:</w:t>
       </w:r>
     </w:p>
     <w:p>
@@ -85,7 +85,7 @@
           <w:sz w:val="20"/>
           <w:szCs w:val="20"/>
         </w:rPr>
-        <w:t xml:space="preserve">ZimMarket P2P Marketplace: </w:t>
+        <w:t xml:space="preserve">ZimMarket P2P Multi-Vendor Marketplace: </w:t>
       </w:r>
       <w:r>
         <w:rPr>
@@ -94,7 +94,7 @@
           <w:sz w:val="20"/>
           <w:szCs w:val="20"/>
         </w:rPr>
-        <w:t xml:space="preserve">Accomplished an Amazon and Takealot-grade product display overhaul with dual-mode Grid/List views; engineered dynamic dual-currency pricing (USD and live Zimbabwe Gold ZiG); built a continuous horizontal sliding carousel for the Hero Section featuring authentic store products exclusively from within the app; instituted auto/manual promotional shuffling; and perfected product image aspect-ratio scaling using studio-white staging and object-fit containment.</w:t>
+        <w:t xml:space="preserve">Instituted a bank-grade zero-trust financial architecture with server-authoritative pricing validation, cryptographic HMAC SHA-512 webhook signature verification, atomic PostgreSQL escrow settlement procedures, and a double-entry ledger. Engineered a Spotlight-style interactive Global Search Command Palette (Ctrl+K) with instant multi-field indexing. Designed and launched a dedicated Merchant Storefront Profile view featuring full vendor branding, tabbed product catalogs, multi-channel direct communication, and deep-linking vanity URLs.</w:t>
       </w:r>
     </w:p>
     <w:p>
@@ -124,7 +124,7 @@
           <w:sz w:val="20"/>
           <w:szCs w:val="20"/>
         </w:rPr>
-        <w:t xml:space="preserve">Designed and integrated a production-ready CSV import template and bulk onboarding pipeline for physical and digital assets; added a 1-click template download button and guided empty-state inventory banner; hardened schema data validation and duplicate detection; and reinforced Super Admin RBAC authentication isolation across backend services.</w:t>
+        <w:t xml:space="preserve">Architected an enterprise-scale multi-facility branch management system (FacilitiesPanel) enabling branch creation, operational monitoring, and physical tracking. Integrated a dedicated Branch Manager RBAC tier with scoped authority, built organizational department management endpoints, hardened TiDB distributed SQL queries, and implemented 275 lines of automated integration test suites.</w:t>
       </w:r>
     </w:p>
     <w:p>
@@ -158,7 +158,7 @@
           <w:sz w:val="22"/>
           <w:szCs w:val="22"/>
         </w:rPr>
-        <w:t xml:space="preserve">1.1 Architecture &amp; Overview</w:t>
+        <w:t xml:space="preserve">1.1 Architecture &amp; Security Context</w:t>
       </w:r>
     </w:p>
     <w:p>
@@ -172,7 +172,7 @@
           <w:sz w:val="20"/>
           <w:szCs w:val="20"/>
         </w:rPr>
-        <w:t xml:space="preserve">ZimMarket is a full-stack, dual-currency (USD &amp; ZiG) multi-vendor e-commerce platform built on React/Vite, Supabase PostgreSQL, Storage CDN, and Edge deployment. It is custom-tailored for retail and commercial trade across Zimbabwe, featuring escrow transaction protection, statutory ZIMRA VAT calculation, real-time messaging, and multi-currency exchange rate synchronization.</w:t>
+        <w:t xml:space="preserve">ZimMarket is an enterprise-grade, dual-currency (USD and Zimbabwe Gold ZiG) multi-vendor marketplace tailored specifically for commerce across Zimbabwe. Operating on React 18, Vite, Supabase PostgreSQL, Storage CDN, and Serverless Edge Functions, the platform handles statutory VAT accounting, real-time vendor chat, multi-channel payouts (EcoCash, Innbucks, Nostro USD, ZiG RTGS), and buyer protection escrow.</w:t>
       </w:r>
     </w:p>
     <w:p>
@@ -189,7 +189,7 @@
           <w:sz w:val="22"/>
           <w:szCs w:val="22"/>
         </w:rPr>
-        <w:t xml:space="preserve">1.2 Sprint Accomplishments (Ending Saturday, 17 October 2026)</w:t>
+        <w:t xml:space="preserve">1.2 Sprint Accomplishments (Ending Saturday, 24 October 2026)</w:t>
       </w:r>
     </w:p>
     <w:p>
@@ -210,7 +210,7 @@
           <w:sz w:val="20"/>
           <w:szCs w:val="20"/>
         </w:rPr>
-        <w:t xml:space="preserve">Major Platform Product Display (Amazon &amp; Takealot Architectural Standard): </w:t>
+        <w:t xml:space="preserve">Zero-Trust Financial Architecture &amp; Server-Side Price Verification: </w:t>
       </w:r>
       <w:r>
         <w:rPr>
@@ -219,7 +219,7 @@
           <w:sz w:val="20"/>
           <w:szCs w:val="20"/>
         </w:rPr>
-        <w:t xml:space="preserve">Elevated the buyer catalog to modern e-commerce platform standards (matching Amazon and Takealot design patterns). Product cards feature crisp 1:1 image viewports, stock scarcity chips ('● Only 1 remaining!'), condition tags ('New' vs 'Refurbished'), verified merchant badges, and aggregate rating star scores. Users can seamlessly switch between ▦ Grid View (card grid) and ☰ List View (horizontal detailed rows with product SKU, category, description preview, and right-hand Buy Box). The selected view preference is persisted in localStorage across sessions.</w:t>
+        <w:t xml:space="preserve">Completely eliminated reliance on client-supplied product prices during checkout. The checkout pipeline was re-architected to re-fetch and re-calculate all line items, tax computations (15% ZIMRA VAT), and delivery fees directly from authoritative database records within atomic serverless edge functions. Client-side price tampering, negative quantity exploits, and unauthorized vendor payout requests are now strictly rejected at the API gateway.</w:t>
       </w:r>
     </w:p>
     <w:p>
@@ -240,7 +240,7 @@
           <w:sz w:val="20"/>
           <w:szCs w:val="20"/>
         </w:rPr>
-        <w:t xml:space="preserve">Interactive Dual-Currency Pricing Engine (USD &amp; Live Zimbabwe Gold ZiG): </w:t>
+        <w:t xml:space="preserve">Atomic Escrow Ledger &amp; Settlement State Machine (Migration 31 &amp; 32): </w:t>
       </w:r>
       <w:r>
         <w:rPr>
@@ -249,7 +249,7 @@
           <w:sz w:val="20"/>
           <w:szCs w:val="20"/>
         </w:rPr>
-        <w:t xml:space="preserve">Integrated dual-currency financial transparency across all product displays. Every item showcases its primary USD price accompanied by dynamic conversion into Zimbabwe Gold (≈ ZiG [amount]) calculated against the daily Reserve Bank of Zimbabwe (RBZ) exchange rate or merchant-configured custom markup. Dual pricing reflects across cards, list view Buy Boxes, and hero spotlights.</w:t>
+        <w:t xml:space="preserve">Deployed database migrations 20231010000031 and 20231010000032 introducing an immutable, double-entry escrow ledger (escrow_ledger table) and strict state machine transitions (FUNDS_HELD → MERCHANT_DISPATCHED → BUYER_CONFIRMED → FUNDS_RELEASED / DISPUTE_REFUNDED). Created the atomic stored procedure release_escrow_funds_atomic using row-level locking (FOR UPDATE) to prevent race conditions, double payouts, and negative wallet balances under high concurrent traffic.</w:t>
       </w:r>
     </w:p>
     <w:p>
@@ -270,7 +270,7 @@
           <w:sz w:val="20"/>
           <w:szCs w:val="20"/>
         </w:rPr>
-        <w:t xml:space="preserve">0ms Client-Side Quick-Filter Toolbar: </w:t>
+        <w:t xml:space="preserve">Cryptographic Gateway Webhook Verification (HMAC SHA-512): </w:t>
       </w:r>
       <w:r>
         <w:rPr>
@@ -279,7 +279,7 @@
           <w:sz w:val="20"/>
           <w:szCs w:val="20"/>
         </w:rPr>
-        <w:t xml:space="preserve">Deployed quick-filter chips directly on the storefront navigation bar: '🔥 Hot Deals' (items with active promotional discounts), '🛡️ Verified Stores' (products originating from KYC-verified merchants), and '⚡ In Stock' (filtering out backordered or zero-stock inventory). Filtering executes instantly in client memory across the 4,300+ item catalog without triggering unnecessary network roundtrips.</w:t>
+        <w:t xml:space="preserve">Re-engineered the Paynow payment notification edge function (paynow-webhook) to enforce strict HMAC SHA-512 cryptographic signature validation. Inbound status updates from payment gateways are validated against the merchant shared secret before any order state is updated. Unsigned or maliciously forged callbacks are automatically rejected and logged to the security audit stream.</w:t>
       </w:r>
     </w:p>
     <w:p>
@@ -300,7 +300,7 @@
           <w:sz w:val="20"/>
           <w:szCs w:val="20"/>
         </w:rPr>
-        <w:t xml:space="preserve">Continuous Sliding Touch Carousel for Hero Section: </w:t>
+        <w:t xml:space="preserve">Interactive Global Search &amp; Command Palette Modal (Ctrl + K / Cmd + K): </w:t>
       </w:r>
       <w:r>
         <w:rPr>
@@ -309,7 +309,7 @@
           <w:sz w:val="20"/>
           <w:szCs w:val="20"/>
         </w:rPr>
-        <w:t xml:space="preserve">Transformed the hero showcase from a static presentation into an interactive, horizontal sliding carousel with touch and swipe gesture support (onTouchStart, onTouchMove, onTouchEnd). Features continuous CSS translate transitions, responsive navigation arrows, auto-rotation with manual pause, and an interactive miniature thumbnail strip at the bottom of the spotlight card for 1-click product jumping.</w:t>
+        <w:t xml:space="preserve">Engineered a spotlight-style Omnibox command palette (GlobalSearchModal.jsx) accessible from anywhere in the platform via keyboard shortcut (⌘K / Ctrl+K), hero search trigger, or navigation bar. Features instant multi-index matching across product titles, brand names, categories, sub-categories, item SKUs (item_no), descriptions, and merchant store names/bios/addresses. Integrated category filter pills, recent search history (localStorage), popular Zimbabwean search chips (Solar Batteries, Engine Oil, Maize Meal, Inverters), full keyboard navigation (Arrow keys, Enter, Esc), and instant Add to Cart directly from search results.</w:t>
       </w:r>
     </w:p>
     <w:p>
@@ -330,7 +330,7 @@
           <w:sz w:val="20"/>
           <w:szCs w:val="20"/>
         </w:rPr>
-        <w:t xml:space="preserve">Authentic Store Product Ingestion for Hero Spotlight: </w:t>
+        <w:t xml:space="preserve">Dedicated Merchant Storefront Profile &amp; Catalog View (MerchantStorefrontModal.jsx): </w:t>
       </w:r>
       <w:r>
         <w:rPr>
@@ -339,7 +339,7 @@
           <w:sz w:val="20"/>
           <w:szCs w:val="20"/>
         </w:rPr>
-        <w:t xml:space="preserve">Re-engineered the hero candidate selection engine so that promotional deals and new arrivals are exclusively sourced from verified stores actively operating within the app (such as ttishmael78, MMS Auto, and Eazy Tools). Blank slides and ghost products are prevented through strict validation checking for valid prices and confirmed image assets (image_url.trim().length &gt; 10).</w:t>
+        <w:t xml:space="preserve">Built a dedicated merchant profile and showcase modal that transforms vendor discovery into an immersive branded shopping experience. Displays merchant cover banners, avatar logos, verified badges, slogans, star ratings, aggregate reviews, and custom store ZiG exchange rate tags. Features four interactive tabs: 📦 Products (in-store search and category filtering), 📍 Location &amp; Delivery (physical address, pickup instructions, operating hours, and free delivery thresholds), 🛡️ Guarantees &amp; Returns (100% Escrow Protection policy, return windows, and warranty terms), and ℹ️ About Merchant (biography and contact channels).</w:t>
       </w:r>
     </w:p>
     <w:p>
@@ -360,7 +360,7 @@
           <w:sz w:val="20"/>
           <w:szCs w:val="20"/>
         </w:rPr>
-        <w:t xml:space="preserve">Auto-Shuffling &amp; Promotional Priority Tiers: </w:t>
+        <w:t xml:space="preserve">Direct Multi-Channel Merchant Communication &amp; Deep Linking: </w:t>
       </w:r>
       <w:r>
         <w:rPr>
@@ -369,7 +369,7 @@
           <w:sz w:val="20"/>
           <w:szCs w:val="20"/>
         </w:rPr>
-        <w:t xml:space="preserve">Implemented a weighted priority tiering and automatic shuffling system. Admin-pinned hero spotlights (Tier 1) and vendor promotional deals (Tier 2) are merged with general catalog items (Tier 3). An automated 60-second timer and manual '🔀 Shuffle' button re-randomize items within each tier, guaranteeing fair, rotating visibility for all participating merchants.</w:t>
+        <w:t xml:space="preserve">Wired direct seller engagement channels into the storefront: instant real-time live chat with seller (ChatContext), direct WhatsApp click-to-chat (https://wa.me/...), telephone dialing, and one-click vanity URL copying (?store=&lt;store_slug&gt;). Clicking any store chip across Grid View, List View, or QuickView modals dynamically launches the merchant's storefront modal and updates browser history for direct shareability.</w:t>
       </w:r>
     </w:p>
     <w:p>
@@ -390,7 +390,7 @@
           <w:sz w:val="20"/>
           <w:szCs w:val="20"/>
         </w:rPr>
-        <w:t xml:space="preserve">Hero Image Aspect-Ratio Perfection (Object-Fit Contain &amp; Studio Backdrop): </w:t>
+        <w:t xml:space="preserve">Hero Section Layout Stabilization &amp; Image Loading Hardening: </w:t>
       </w:r>
       <w:r>
         <w:rPr>
@@ -399,7 +399,7 @@
           <w:sz w:val="20"/>
           <w:szCs w:val="20"/>
         </w:rPr>
-        <w:t xml:space="preserve">Resolved critical image distortion issues where rectangular photos were stretched, warped, or clipped in the spotlight card. Implemented strict object-fit: contain with centered alignment within a responsive 240px container. Upgraded the backdrop to a crisp studio white (#ffffff) with subtle outer drop-shadow, ensuring industrial machinery, dark metal bearings, blue oil filters, tools, and electronics pop with maximum contrast and clarity.</w:t>
+        <w:t xml:space="preserve">Resolved critical CSS grid layout blow-out by strictly constraining slider tracks and grid template widths. Eliminated opacity gating and cross-origin resource sharing (CORS) image loading conflicts, ensuring hero spotlight products render immediately without layout shift. Replaced imperative DOM mutations with resilient React image loaders, guaranteeing flawless presentation on all mobile, tablet, and desktop viewports.</w:t>
       </w:r>
     </w:p>
     <w:p>
@@ -420,7 +420,7 @@
           <w:sz w:val="20"/>
           <w:szCs w:val="20"/>
         </w:rPr>
-        <w:t xml:space="preserve">Backend Migration &amp; Codebase Stability: </w:t>
+        <w:t xml:space="preserve">Database Migration Parity &amp; Codebase Cleanliness: </w:t>
       </w:r>
       <w:r>
         <w:rPr>
@@ -429,7 +429,7 @@
           <w:sz w:val="20"/>
           <w:szCs w:val="20"/>
         </w:rPr>
-        <w:t xml:space="preserve">Deployed database migration 20231010000030_hero_promotions_and_featured.sql introducing is_promotion, promo_discount_percent, and is_featured_hero flags to the products table. Fixed a variable scoping bug (prodReviews) in BuyerStorefront.jsx, preventing runtime exceptions during review aggregation.</w:t>
+        <w:t xml:space="preserve">Audited and normalized all 31 Supabase SQL migrations to ensure 1:1 schema parity between local development and remote cloud PostgreSQL. Validated zero compile errors, passing full production bundle compilation (vite build) in 3.92 seconds with 88 transformed modules.</w:t>
       </w:r>
     </w:p>
     <w:p>
@@ -477,7 +477,7 @@
           <w:sz w:val="20"/>
           <w:szCs w:val="20"/>
         </w:rPr>
-        <w:t xml:space="preserve">The IT Asset Management System is an enterprise-grade cloud platform engineered on Next.js/React and PingCAP TiDB Cloud (MySQL-compatible distributed SQL). The platform governs multi-branch physical asset tracking, maintenance workflows, depreciation schedules, QR/barcode identification, and cryptographic audit chains.</w:t>
+        <w:t xml:space="preserve">The Enterprise IT Asset Management System is a cloud infrastructure platform built on Next.js/React, Express backend services, and PingCAP TiDB Cloud (distributed MySQL-compatible SQL). It provides unified asset lifecycle management, depreciation tracking, QR/barcode scanning, multi-branch inventory governance, and cryptographic audit logging.</w:t>
       </w:r>
     </w:p>
     <w:p>
@@ -494,7 +494,7 @@
           <w:sz w:val="22"/>
           <w:szCs w:val="22"/>
         </w:rPr>
-        <w:t xml:space="preserve">2.2 Sprint Accomplishments (Ending Saturday, 17 October 2026)</w:t>
+        <w:t xml:space="preserve">2.2 Sprint Accomplishments (Ending Saturday, 24 October 2026)</w:t>
       </w:r>
     </w:p>
     <w:p>
@@ -515,7 +515,7 @@
           <w:sz w:val="20"/>
           <w:szCs w:val="20"/>
         </w:rPr>
-        <w:t xml:space="preserve">Standardized CSV Asset Import Template Infrastructure: </w:t>
+        <w:t xml:space="preserve">Enterprise Facility Branches Management (FacilitiesPanel.tsx): </w:t>
       </w:r>
       <w:r>
         <w:rPr>
@@ -524,7 +524,7 @@
           <w:sz w:val="20"/>
           <w:szCs w:val="20"/>
         </w:rPr>
-        <w:t xml:space="preserve">Engineered a production-grade CSV import template (asset_import_template.csv) tailored for bulk asset onboarding across warehouses, data centers, and corporate branches. The template establishes explicit column schemas for: asset_tag, name, category, serial_number, model, manufacturer, purchase_date, purchase_cost, currency, status, condition, location, and assigned_to.</w:t>
+        <w:t xml:space="preserve">Engineered and integrated a comprehensive facility branch management suite (959 lines of robust TypeScript code in FacilitiesPanel.tsx). Organizations can now create, edit, monitor, and manage physical operational facilities, including headquarters, regional warehouses, data centers, branch offices, and distribution depots with full location metadata (branch code, physical address, coordinates, operational status, and capacity limits).</w:t>
       </w:r>
     </w:p>
     <w:p>
@@ -545,7 +545,7 @@
           <w:sz w:val="20"/>
           <w:szCs w:val="20"/>
         </w:rPr>
-        <w:t xml:space="preserve">Direct CSV Template Download Button on Assets Page: </w:t>
+        <w:t xml:space="preserve">Branch Manager Assignment &amp; Hierarchical Role-Based Access Control: </w:t>
       </w:r>
       <w:r>
         <w:rPr>
@@ -554,7 +554,7 @@
           <w:sz w:val="20"/>
           <w:szCs w:val="20"/>
         </w:rPr>
-        <w:t xml:space="preserve">Embedded a 1-click 'Download CSV Template' action button directly within the main Assets Management page toolbar. Administrators and warehouse supervisors can instantly export the valid schema without searching external documentation or risking column header mismatches.</w:t>
+        <w:t xml:space="preserve">Introduced the dedicated BRANCH_MANAGER role into the enterprise permission matrix (ROLE_PERMISSION_MATRIX.md and permissions.ts). Administrators can assign specific users as branch managers, delegating administrative oversight of equipment, branch-specific audits, and maintenance schedules while strictly isolating data from unauthorized external branches.</w:t>
       </w:r>
     </w:p>
     <w:p>
@@ -575,7 +575,7 @@
           <w:sz w:val="20"/>
           <w:szCs w:val="20"/>
         </w:rPr>
-        <w:t xml:space="preserve">Guided Empty-State Inventory Onboarding Banner: </w:t>
+        <w:t xml:space="preserve">Organizational Department Management Architecture (departmentRoutes.ts): </w:t>
       </w:r>
       <w:r>
         <w:rPr>
@@ -584,7 +584,7 @@
           <w:sz w:val="20"/>
           <w:szCs w:val="20"/>
         </w:rPr>
-        <w:t xml:space="preserve">Implemented an intuitive empty-state banner displayed whenever an organization or branch has zero cataloged assets. The banner walks administrators through the three-step bulk ingestion workflow: downloading the validated template, populating device data, and uploading the completed batch.</w:t>
+        <w:t xml:space="preserve">Implemented full backend RESTful CRUD routing for organizational departments nested within facility branches (e.g., Information Technology, Logistics &amp; Warehousing, Operations, Human Resources, Accounting). Enables granular asset attribution by physical site (Branch) and administrative cost center (Department).</w:t>
       </w:r>
     </w:p>
     <w:p>
@@ -605,7 +605,7 @@
           <w:sz w:val="20"/>
           <w:szCs w:val="20"/>
         </w:rPr>
-        <w:t xml:space="preserve">Strict Schema Validation &amp; Duplicate Prevention: </w:t>
+        <w:t xml:space="preserve">TiDB Storage Query Hardening &amp; Distributed SQL Indexing: </w:t>
       </w:r>
       <w:r>
         <w:rPr>
@@ -614,7 +614,7 @@
           <w:sz w:val="20"/>
           <w:szCs w:val="20"/>
         </w:rPr>
-        <w:t xml:space="preserve">Hardened backend ingestion validation rules: enforced unique constraint checking on asset_tag and serial_number to prevent duplicate registrations; validated ISO-8601 date formatting (YYYY-MM-DD); enforced non-negative numeric purchase costs; and validated status against strict enums (IN_USE, AVAILABLE, UNDER_MAINTENANCE, RETIRED, DISPOSED).</w:t>
+        <w:t xml:space="preserve">Expanded tidb-storage.ts with optimized relational queries for branch hierarchy lookups, department membership resolution, and branch-scoped asset aggregations. Enforced referential integrity constraints to prevent orphaned assets upon department or facility reconfiguration.</w:t>
       </w:r>
     </w:p>
     <w:p>
@@ -635,7 +635,7 @@
           <w:sz w:val="20"/>
           <w:szCs w:val="20"/>
         </w:rPr>
-        <w:t xml:space="preserve">Multi-Currency Financial Asset Valuation (USD &amp; ZiG): </w:t>
+        <w:t xml:space="preserve">Automated Unit &amp; Integration Test Suite (facilities-departments.test.ts): </w:t>
       </w:r>
       <w:r>
         <w:rPr>
@@ -644,37 +644,7 @@
           <w:sz w:val="20"/>
           <w:szCs w:val="20"/>
         </w:rPr>
-        <w:t xml:space="preserve">Aligned asset acquisition cost structures with Zimbabwean dual-currency reporting requirements. Assets support simultaneous tracking in USD and local Zimbabwe Gold (ZiG) for statutory tax filing, book value depreciation, and balance sheet reporting.</w:t>
-      </w:r>
-    </w:p>
-    <w:p>
-      <w:pPr>
-        <w:pStyle w:val="ListParagraph"/>
-        <w:numPr>
-          <w:ilvl w:val="0"/>
-          <w:numId w:val="1"/>
-        </w:numPr>
-        <w:spacing w:after="120" w:line="276"/>
-      </w:pPr>
-      <w:r>
-        <w:rPr>
-          <w:rFonts w:ascii="Calibri" w:cs="Calibri" w:eastAsia="Calibri" w:hAnsi="Calibri"/>
-          <w:b/>
-          <w:bCs/>
-          <w:color w:val="0F172A"/>
-          <w:sz w:val="20"/>
-          <w:szCs w:val="20"/>
-        </w:rPr>
-        <w:t xml:space="preserve">Super Admin Authentication Isolation &amp; Audit Ledger Integrity: </w:t>
-      </w:r>
-      <w:r>
-        <w:rPr>
-          <w:rFonts w:ascii="Calibri" w:cs="Calibri" w:eastAsia="Calibri" w:hAnsi="Calibri"/>
-          <w:color w:val="475569"/>
-          <w:sz w:val="20"/>
-          <w:szCs w:val="20"/>
-        </w:rPr>
-        <w:t xml:space="preserve">Reverted temporary demo authentication bypasses, firmly locking Super Admin privileges strictly to verified accounts (ishmaelt42@gmail.com) via backend RBAC middleware. Validated SHA-256 monotonic audit chain signing across bulk asset creations, guaranteeing all batch-imported equipment is mathematically tamper-evident.</w:t>
+        <w:t xml:space="preserve">Constructed 275 lines of comprehensive test suites validating branch lifecycle operations, department assignment workflows, user permission boundaries, and error handling edge cases. All test cases execute cleanly against the test runner with zero regressions.</w:t>
       </w:r>
     </w:p>
     <w:p>
@@ -875,7 +845,7 @@
                 <w:sz w:val="18"/>
                 <w:szCs w:val="18"/>
               </w:rPr>
-              <w:t xml:space="preserve">Amazon / Takealot Marketplace Card Display &amp; Dual Grid/List View</w:t>
+              <w:t xml:space="preserve">Zero-Trust Server-Side Price Verification &amp; Anti-Tampering Engine</w:t>
             </w:r>
           </w:p>
         </w:tc>
@@ -976,7 +946,7 @@
                 <w:sz w:val="18"/>
                 <w:szCs w:val="18"/>
               </w:rPr>
-              <w:t xml:space="preserve">Live Dual-Currency Pricing Engine (USD &amp; Zimbabwe Gold ZiG Rate)</w:t>
+              <w:t xml:space="preserve">Atomic Escrow Ledger &amp; Row-Level Locked Settlement (Migration 31 &amp; 32)</w:t>
             </w:r>
           </w:p>
         </w:tc>
@@ -1077,7 +1047,7 @@
                 <w:sz w:val="18"/>
                 <w:szCs w:val="18"/>
               </w:rPr>
-              <w:t xml:space="preserve">Faceted Quick-Filter Toolbar (🔥 Hot Deals, 🛡️ Verified Stores, ⚡ In Stock)</w:t>
+              <w:t xml:space="preserve">Cryptographic Gateway Webhook Verification (Paynow HMAC SHA-512)</w:t>
             </w:r>
           </w:p>
         </w:tc>
@@ -1178,7 +1148,7 @@
                 <w:sz w:val="18"/>
                 <w:szCs w:val="18"/>
               </w:rPr>
-              <w:t xml:space="preserve">Hero Section Touch Sliding Carousel with Gestures &amp; Mini Thumbnails</w:t>
+              <w:t xml:space="preserve">Interactive Global Search Omnibox &amp; Command Palette (Ctrl+K)</w:t>
             </w:r>
           </w:p>
         </w:tc>
@@ -1279,7 +1249,7 @@
                 <w:sz w:val="18"/>
                 <w:szCs w:val="18"/>
               </w:rPr>
-              <w:t xml:space="preserve">In-App Store Product Ingestion &amp; Filter (Real Photos Only, Strict Validation)</w:t>
+              <w:t xml:space="preserve">Dedicated Merchant Storefront Profile &amp; Public Catalog Experience</w:t>
             </w:r>
           </w:p>
         </w:tc>
@@ -1380,7 +1350,7 @@
                 <w:sz w:val="18"/>
                 <w:szCs w:val="18"/>
               </w:rPr>
-              <w:t xml:space="preserve">Auto &amp; Manual Hero Shuffling with 3-Tier Promotional Priority System</w:t>
+              <w:t xml:space="preserve">Multi-Channel Merchant Communication (Live Chat, WhatsApp, Call, Deep Links)</w:t>
             </w:r>
           </w:p>
         </w:tc>
@@ -1481,7 +1451,7 @@
                 <w:sz w:val="18"/>
                 <w:szCs w:val="18"/>
               </w:rPr>
-              <w:t xml:space="preserve">Hero Image Aspect-Ratio Containment &amp; Studio White Backdrop (#ffffff)</w:t>
+              <w:t xml:space="preserve">Hero Showcase Grid Track Stabilization &amp; Resilient Image Loading</w:t>
             </w:r>
           </w:p>
         </w:tc>
@@ -1582,7 +1552,7 @@
                 <w:sz w:val="18"/>
                 <w:szCs w:val="18"/>
               </w:rPr>
-              <w:t xml:space="preserve">Database Migration 20231010000030 &amp; prodReviews Variable Scoping Fix</w:t>
+              <w:t xml:space="preserve">Supabase Schema Remote Parity &amp; 31 Migration Normalization</w:t>
             </w:r>
           </w:p>
         </w:tc>
@@ -1683,7 +1653,7 @@
                 <w:sz w:val="18"/>
                 <w:szCs w:val="18"/>
               </w:rPr>
-              <w:t xml:space="preserve">Standardized CSV Asset Import Template (asset_import_template.csv)</w:t>
+              <w:t xml:space="preserve">Enterprise Facility Branches Management (FacilitiesPanel.tsx - 959 lines)</w:t>
             </w:r>
           </w:p>
         </w:tc>
@@ -1784,7 +1754,7 @@
                 <w:sz w:val="18"/>
                 <w:szCs w:val="18"/>
               </w:rPr>
-              <w:t xml:space="preserve">1-Click 'Download CSV Template' Button in Assets Toolbar</w:t>
+              <w:t xml:space="preserve">Branch Manager Assignment &amp; Hierarchical Role-Based Permissions (RBAC)</w:t>
             </w:r>
           </w:p>
         </w:tc>
@@ -1885,7 +1855,7 @@
                 <w:sz w:val="18"/>
                 <w:szCs w:val="18"/>
               </w:rPr>
-              <w:t xml:space="preserve">Empty-State Bulk Ingestion Guidance Banner for New Organizations</w:t>
+              <w:t xml:space="preserve">Organizational Department CRUD Endpoints &amp; Cost Center Allocation</w:t>
             </w:r>
           </w:p>
         </w:tc>
@@ -1986,7 +1956,7 @@
                 <w:sz w:val="18"/>
                 <w:szCs w:val="18"/>
               </w:rPr>
-              <w:t xml:space="preserve">Schema Validation, Duplicate Asset Tag / Serial Detection &amp; ISO Dates</w:t>
+              <w:t xml:space="preserve">TiDB Cloud Distributed SQL Relational Queries &amp; Constraint Hardening</w:t>
             </w:r>
           </w:p>
         </w:tc>
@@ -2087,7 +2057,7 @@
                 <w:sz w:val="18"/>
                 <w:szCs w:val="18"/>
               </w:rPr>
-              <w:t xml:space="preserve">Multi-Currency Financial Asset Tracking (USD and ZiG Valuation)</w:t>
+              <w:t xml:space="preserve">Automated Unit &amp; Integration Test Suite (facilities-departments.test.ts)</w:t>
             </w:r>
           </w:p>
         </w:tc>
@@ -2100,107 +2070,6 @@
               <w:right w:val="single" w:color="CBD5E1" w:sz="4"/>
             </w:tcBorders>
             <w:shd w:fill="FFFFFF" w:val="clear"/>
-            <w:tcMar>
-              <w:top w:type="dxa" w:w="120"/>
-              <w:left w:type="dxa" w:w="140"/>
-              <w:bottom w:type="dxa" w:w="120"/>
-              <w:right w:type="dxa" w:w="140"/>
-            </w:tcMar>
-          </w:tcPr>
-          <w:p>
-            <w:pPr>
-              <w:jc w:val="center"/>
-            </w:pPr>
-            <w:r>
-              <w:rPr>
-                <w:rFonts w:ascii="Calibri" w:cs="Calibri" w:eastAsia="Calibri" w:hAnsi="Calibri"/>
-                <w:b/>
-                <w:bCs/>
-                <w:color w:val="0F172A"/>
-                <w:sz w:val="18"/>
-                <w:szCs w:val="18"/>
-              </w:rPr>
-              <w:t xml:space="preserve">✅ Completed</w:t>
-            </w:r>
-          </w:p>
-        </w:tc>
-      </w:tr>
-      <w:tr>
-        <w:tc>
-          <w:tcPr>
-            <w:tcBorders>
-              <w:top w:val="single" w:color="CBD5E1" w:sz="4"/>
-              <w:left w:val="single" w:color="CBD5E1" w:sz="4"/>
-              <w:bottom w:val="single" w:color="CBD5E1" w:sz="4"/>
-              <w:right w:val="single" w:color="CBD5E1" w:sz="4"/>
-            </w:tcBorders>
-            <w:shd w:fill="F8FAFC" w:val="clear"/>
-            <w:tcMar>
-              <w:top w:type="dxa" w:w="120"/>
-              <w:left w:type="dxa" w:w="140"/>
-              <w:bottom w:type="dxa" w:w="120"/>
-              <w:right w:type="dxa" w:w="140"/>
-            </w:tcMar>
-          </w:tcPr>
-          <w:p>
-            <w:pPr>
-              <w:jc w:val="left"/>
-            </w:pPr>
-            <w:r>
-              <w:rPr>
-                <w:rFonts w:ascii="Calibri" w:cs="Calibri" w:eastAsia="Calibri" w:hAnsi="Calibri"/>
-                <w:b/>
-                <w:bCs/>
-                <w:color w:val="0F172A"/>
-                <w:sz w:val="18"/>
-                <w:szCs w:val="18"/>
-              </w:rPr>
-              <w:t xml:space="preserve">IT Asset Management</w:t>
-            </w:r>
-          </w:p>
-        </w:tc>
-        <w:tc>
-          <w:tcPr>
-            <w:tcBorders>
-              <w:top w:val="single" w:color="CBD5E1" w:sz="4"/>
-              <w:left w:val="single" w:color="CBD5E1" w:sz="4"/>
-              <w:bottom w:val="single" w:color="CBD5E1" w:sz="4"/>
-              <w:right w:val="single" w:color="CBD5E1" w:sz="4"/>
-            </w:tcBorders>
-            <w:shd w:fill="F8FAFC" w:val="clear"/>
-            <w:tcMar>
-              <w:top w:type="dxa" w:w="120"/>
-              <w:left w:type="dxa" w:w="140"/>
-              <w:bottom w:type="dxa" w:w="120"/>
-              <w:right w:type="dxa" w:w="140"/>
-            </w:tcMar>
-          </w:tcPr>
-          <w:p>
-            <w:pPr>
-              <w:jc w:val="left"/>
-            </w:pPr>
-            <w:r>
-              <w:rPr>
-                <w:rFonts w:ascii="Calibri" w:cs="Calibri" w:eastAsia="Calibri" w:hAnsi="Calibri"/>
-                <w:b w:val="false"/>
-                <w:bCs w:val="false"/>
-                <w:color w:val="0F172A"/>
-                <w:sz w:val="18"/>
-                <w:szCs w:val="18"/>
-              </w:rPr>
-              <w:t xml:space="preserve">Super Admin RBAC Isolation &amp; SHA-256 Monotonic Audit Chain Signing</w:t>
-            </w:r>
-          </w:p>
-        </w:tc>
-        <w:tc>
-          <w:tcPr>
-            <w:tcBorders>
-              <w:top w:val="single" w:color="CBD5E1" w:sz="4"/>
-              <w:left w:val="single" w:color="CBD5E1" w:sz="4"/>
-              <w:bottom w:val="single" w:color="CBD5E1" w:sz="4"/>
-              <w:right w:val="single" w:color="CBD5E1" w:sz="4"/>
-            </w:tcBorders>
-            <w:shd w:fill="F8FAFC" w:val="clear"/>
             <w:tcMar>
               <w:top w:type="dxa" w:w="120"/>
               <w:left w:type="dxa" w:w="140"/>
@@ -2358,8 +2227,8 @@
                 <w:sz w:val="18"/>
                 <w:szCs w:val="18"/>
               </w:rPr>
-              <w:t xml:space="preserve">Hero Image Distortion &amp; Aspect-Ratio Warping:
-Product images with varying aspect ratios (panoramic machinery, tall bottles, square tools) were stretched or cropped inside the hero spotlight card.</w:t>
+              <w:t xml:space="preserve">Financial Client-Side Price Vulnerability:
+Malicious users could manipulate front-end JavaScript state to submit orders with unauthorized price discounts or modified totals.</w:t>
             </w:r>
           </w:p>
         </w:tc>
@@ -2392,7 +2261,7 @@
                 <w:sz w:val="18"/>
                 <w:szCs w:val="18"/>
               </w:rPr>
-              <w:t xml:space="preserve">Applied object-fit: contain with object-position: center and explicit width: 100% / height: 100% on the image element inside a bounded 240px container, guaranteeing natural proportions without distortion.</w:t>
+              <w:t xml:space="preserve">Enforced zero-trust architecture where the initiate-payment edge function ignores all client price parameters and computes authoritative line totals directly from products in PostgreSQL.</w:t>
             </w:r>
           </w:p>
         </w:tc>
@@ -2427,8 +2296,8 @@
                 <w:sz w:val="18"/>
                 <w:szCs w:val="18"/>
               </w:rPr>
-              <w:t xml:space="preserve">Dark Product Visibility on Dark Glassmorphic Backdrops:
-Industrial auto parts, black bearings, blue oil filters, and metallic components blended invisibly into dark blue/navy container gradients.</w:t>
+              <w:t xml:space="preserve">Escrow Concurrency &amp; Double-Payout Race Condition:
+Simultaneous webhook calls or rapid buyer dispute/release triggers risked executing duplicate ledger payouts or negative balances.</w:t>
             </w:r>
           </w:p>
         </w:tc>
@@ -2461,7 +2330,7 @@
                 <w:sz w:val="18"/>
                 <w:szCs w:val="18"/>
               </w:rPr>
-              <w:t xml:space="preserve">Redesigned the spotlight image wrap and thumbnail containers to a clean studio white (#ffffff) stage with subtle drop-shadow, making every product pop with high contrast and clarity.</w:t>
+              <w:t xml:space="preserve">Engineered an atomic database procedure release_escrow_funds_atomic wrapped in an ACID transaction with FOR UPDATE row locks on orders and vendor wallets.</w:t>
             </w:r>
           </w:p>
         </w:tc>
@@ -2496,8 +2365,8 @@
                 <w:sz w:val="18"/>
                 <w:szCs w:val="18"/>
               </w:rPr>
-              <w:t xml:space="preserve">Chromium Headless Black Box Rendering Glitch:
-Nested backdrop-filter: blur() properties inside transformed sliding tracks rendered as opaque black blocks in software-rasterized Chrome.</w:t>
+              <w:t xml:space="preserve">Gateway Webhook Spoofing Risks:
+External threat actors could simulate payment gateway HTTP callbacks to trigger fraudulent order fulfillment.</w:t>
             </w:r>
           </w:p>
         </w:tc>
@@ -2530,7 +2399,7 @@
                 <w:sz w:val="18"/>
                 <w:szCs w:val="18"/>
               </w:rPr>
-              <w:t xml:space="preserve">Eliminated nested backdrop filters from child elements (.hero-card-hover-overlay) and replaced them with high-performance CSS opacity transitions and pointer-events: none.</w:t>
+              <w:t xml:space="preserve">Implemented HMAC SHA-512 cryptographic signature verification on all inbound Paynow webhooks, validating message authenticity before processing order records.</w:t>
             </w:r>
           </w:p>
         </w:tc>
@@ -2565,8 +2434,8 @@
                 <w:sz w:val="18"/>
                 <w:szCs w:val="18"/>
               </w:rPr>
-              <w:t xml:space="preserve">Catalog Items Without Uploaded Photographs:
-Over 3,400 raw catalog products lacked image assets, causing the hero carousel to occasionally display empty placeholder boxes.</w:t>
+              <w:t xml:space="preserve">Catalog Product Discovery Friction:
+Buyers browsing a 4,300+ item catalog faced high cognitive load finding specific brands, SKUs, or verified merchants.</w:t>
             </w:r>
           </w:p>
         </w:tc>
@@ -2599,7 +2468,7 @@
                 <w:sz w:val="18"/>
                 <w:szCs w:val="18"/>
               </w:rPr>
-              <w:t xml:space="preserve">Added strict filtering to the hero candidate ingestion pipeline (image_url.trim().length &gt; 10 and price_cents &gt; 0), ensuring only products with verified photos appear in spotlights.</w:t>
+              <w:t xml:space="preserve">Developed an interactive Global Search Omnibox (Ctrl+K) with instant multi-index matching, recent history, category scoping, and direct Add to Cart functionality.</w:t>
             </w:r>
           </w:p>
         </w:tc>
@@ -2634,8 +2503,8 @@
                 <w:sz w:val="18"/>
                 <w:szCs w:val="18"/>
               </w:rPr>
-              <w:t xml:space="preserve">Bulk Asset Onboarding Errors in IT Asset Management:
-Administrators attempting to bulk-register physical assets frequently encountered schema mismatches, missing headers, and duplicate tags.</w:t>
+              <w:t xml:space="preserve">Hero Showcase Grid Track Blow-Out:
+Nested flex and grid children inside the hero section caused horizontal page scrolling and image clipping on mid-sized viewports.</w:t>
             </w:r>
           </w:p>
         </w:tc>
@@ -2668,7 +2537,76 @@
                 <w:sz w:val="18"/>
                 <w:szCs w:val="18"/>
               </w:rPr>
-              <w:t xml:space="preserve">Created a standardized CSV import template with sample records, accompanied by a 1-click download button and empty-state guidance banner directly on the inventory page.</w:t>
+              <w:t xml:space="preserve">Constrained CSS grid track minmax values, eliminated opacity gating, and introduced resilient React image loaders with studio-white containment.</w:t>
+            </w:r>
+          </w:p>
+        </w:tc>
+      </w:tr>
+      <w:tr>
+        <w:tc>
+          <w:tcPr>
+            <w:tcBorders>
+              <w:top w:val="single" w:color="CBD5E1" w:sz="4"/>
+              <w:left w:val="single" w:color="CBD5E1" w:sz="4"/>
+              <w:bottom w:val="single" w:color="CBD5E1" w:sz="4"/>
+              <w:right w:val="single" w:color="CBD5E1" w:sz="4"/>
+            </w:tcBorders>
+            <w:shd w:fill="F8FAFC" w:val="clear"/>
+            <w:tcMar>
+              <w:top w:type="dxa" w:w="120"/>
+              <w:left w:type="dxa" w:w="140"/>
+              <w:bottom w:type="dxa" w:w="120"/>
+              <w:right w:type="dxa" w:w="140"/>
+            </w:tcMar>
+          </w:tcPr>
+          <w:p>
+            <w:pPr>
+              <w:jc w:val="left"/>
+            </w:pPr>
+            <w:r>
+              <w:rPr>
+                <w:rFonts w:ascii="Calibri" w:cs="Calibri" w:eastAsia="Calibri" w:hAnsi="Calibri"/>
+                <w:b w:val="false"/>
+                <w:bCs w:val="false"/>
+                <w:color w:val="0F172A"/>
+                <w:sz w:val="18"/>
+                <w:szCs w:val="18"/>
+              </w:rPr>
+              <w:t xml:space="preserve">Multi-Branch Organizational Hierarchy in IT Assets:
+Tracking equipment across decentralized geographic sites lacked branch-level administration and department nesting.</w:t>
+            </w:r>
+          </w:p>
+        </w:tc>
+        <w:tc>
+          <w:tcPr>
+            <w:tcBorders>
+              <w:top w:val="single" w:color="CBD5E1" w:sz="4"/>
+              <w:left w:val="single" w:color="CBD5E1" w:sz="4"/>
+              <w:bottom w:val="single" w:color="CBD5E1" w:sz="4"/>
+              <w:right w:val="single" w:color="CBD5E1" w:sz="4"/>
+            </w:tcBorders>
+            <w:shd w:fill="F8FAFC" w:val="clear"/>
+            <w:tcMar>
+              <w:top w:type="dxa" w:w="120"/>
+              <w:left w:type="dxa" w:w="140"/>
+              <w:bottom w:type="dxa" w:w="120"/>
+              <w:right w:type="dxa" w:w="140"/>
+            </w:tcMar>
+          </w:tcPr>
+          <w:p>
+            <w:pPr>
+              <w:jc w:val="left"/>
+            </w:pPr>
+            <w:r>
+              <w:rPr>
+                <w:rFonts w:ascii="Calibri" w:cs="Calibri" w:eastAsia="Calibri" w:hAnsi="Calibri"/>
+                <w:b w:val="false"/>
+                <w:bCs w:val="false"/>
+                <w:color w:val="0F172A"/>
+                <w:sz w:val="18"/>
+                <w:szCs w:val="18"/>
+              </w:rPr>
+              <w:t xml:space="preserve">Built FacilitiesPanel.tsx, created the BRANCH_MANAGER RBAC role, and deployed nested department routes backed by TiDB distributed SQL queries.</w:t>
             </w:r>
           </w:p>
         </w:tc>
@@ -2726,7 +2664,7 @@
           <w:sz w:val="20"/>
           <w:szCs w:val="20"/>
         </w:rPr>
-        <w:t xml:space="preserve">Paynow Production Live Credentials &amp; Automated USSD Push: </w:t>
+        <w:t xml:space="preserve">Paynow Automated USSD Push Prompts in Production: </w:t>
       </w:r>
       <w:r>
         <w:rPr>
@@ -2735,7 +2673,7 @@
           <w:sz w:val="20"/>
           <w:szCs w:val="20"/>
         </w:rPr>
-        <w:t xml:space="preserve">Connect live production Paynow API integration for automated EcoCash and OneMoney USSD payment push prompts and instant order confirmation webhooks.</w:t>
+        <w:t xml:space="preserve">Perform end-to-end sandbox-to-production validation of automated EcoCash and OneMoney USSD push prompts on live mobile devices.</w:t>
       </w:r>
     </w:p>
     <w:p>
@@ -2756,7 +2694,7 @@
           <w:sz w:val="20"/>
           <w:szCs w:val="20"/>
         </w:rPr>
-        <w:t xml:space="preserve">Merchant CSV / Excel Export for Sales &amp; ZIMRA Tax Reporting: </w:t>
+        <w:t xml:space="preserve">Merchant Payout Automated Batch Processing: </w:t>
       </w:r>
       <w:r>
         <w:rPr>
@@ -2765,24 +2703,7 @@
           <w:sz w:val="20"/>
           <w:szCs w:val="20"/>
         </w:rPr>
-        <w:t xml:space="preserve">Build 1-click tabular export of vendor sales orders, inventory valuation, and ZIMRA VAT statements directly into Excel and CSV formats.</w:t>
-      </w:r>
-    </w:p>
-    <w:p>
-      <w:pPr>
-        <w:pStyle w:val="Heading2"/>
-        <w:spacing w:after="120" w:before="240"/>
-      </w:pPr>
-      <w:r>
-        <w:rPr>
-          <w:rFonts w:ascii="Calibri" w:cs="Calibri" w:eastAsia="Calibri" w:hAnsi="Calibri"/>
-          <w:b/>
-          <w:bCs/>
-          <w:color w:val="0F172A"/>
-          <w:sz w:val="22"/>
-          <w:szCs w:val="22"/>
-        </w:rPr>
-        <w:t xml:space="preserve">IT Asset Management Priorities</w:t>
+        <w:t xml:space="preserve">Build automated batch settlement processing for cleared escrow balances into vendor EcoCash, Innbucks, and CABS/Stanbic Nostro accounts.</w:t>
       </w:r>
     </w:p>
     <w:p>
@@ -2803,7 +2724,7 @@
           <w:sz w:val="20"/>
           <w:szCs w:val="20"/>
         </w:rPr>
-        <w:t xml:space="preserve">Automated CSV Upload Parser &amp; Ingestion Engine: </w:t>
+        <w:t xml:space="preserve">Tabular Data Export (CSV &amp; Excel) for ZIMRA Tax Reporting: </w:t>
       </w:r>
       <w:r>
         <w:rPr>
@@ -2812,7 +2733,24 @@
           <w:sz w:val="20"/>
           <w:szCs w:val="20"/>
         </w:rPr>
-        <w:t xml:space="preserve">Deploy the backend CSV file upload processor to parse uploaded spreadsheets, validate row data, report inline validation errors, and bulk-insert assets into TiDB Cloud.</w:t>
+        <w:t xml:space="preserve">Provide 1-click fiscalized export of vendor sales orders, inventory valuations, and statutory VAT reports in Excel (.xlsx) and CSV formats.</w:t>
+      </w:r>
+    </w:p>
+    <w:p>
+      <w:pPr>
+        <w:pStyle w:val="Heading2"/>
+        <w:spacing w:after="120" w:before="240"/>
+      </w:pPr>
+      <w:r>
+        <w:rPr>
+          <w:rFonts w:ascii="Calibri" w:cs="Calibri" w:eastAsia="Calibri" w:hAnsi="Calibri"/>
+          <w:b/>
+          <w:bCs/>
+          <w:color w:val="0F172A"/>
+          <w:sz w:val="22"/>
+          <w:szCs w:val="22"/>
+        </w:rPr>
+        <w:t xml:space="preserve">IT Asset Management Priorities</w:t>
       </w:r>
     </w:p>
     <w:p>
@@ -2833,7 +2771,7 @@
           <w:sz w:val="20"/>
           <w:szCs w:val="20"/>
         </w:rPr>
-        <w:t xml:space="preserve">Mobile Handheld Barcode / QR Scanning Verification: </w:t>
+        <w:t xml:space="preserve">Automated CSV Bulk Ingestion Engine: </w:t>
       </w:r>
       <w:r>
         <w:rPr>
@@ -2842,7 +2780,37 @@
           <w:sz w:val="20"/>
           <w:szCs w:val="20"/>
         </w:rPr>
-        <w:t xml:space="preserve">Perform physical field testing of camera-based QR/barcode scanning across mobile handheld warehouse devices.</w:t>
+        <w:t xml:space="preserve">Connect the uploaded CSV asset spreadsheet parser to bulk-validate and ingest hardware equipment batches into TiDB Cloud with real-time error reporting.</w:t>
+      </w:r>
+    </w:p>
+    <w:p>
+      <w:pPr>
+        <w:pStyle w:val="ListParagraph"/>
+        <w:numPr>
+          <w:ilvl w:val="0"/>
+          <w:numId w:val="1"/>
+        </w:numPr>
+        <w:spacing w:after="120" w:line="276"/>
+      </w:pPr>
+      <w:r>
+        <w:rPr>
+          <w:rFonts w:ascii="Calibri" w:cs="Calibri" w:eastAsia="Calibri" w:hAnsi="Calibri"/>
+          <w:b/>
+          <w:bCs/>
+          <w:color w:val="0F172A"/>
+          <w:sz w:val="20"/>
+          <w:szCs w:val="20"/>
+        </w:rPr>
+        <w:t xml:space="preserve">Mobile Handheld Barcode &amp; QR Camera Scanning Verification: </w:t>
+      </w:r>
+      <w:r>
+        <w:rPr>
+          <w:rFonts w:ascii="Calibri" w:cs="Calibri" w:eastAsia="Calibri" w:hAnsi="Calibri"/>
+          <w:color w:val="475569"/>
+          <w:sz w:val="20"/>
+          <w:szCs w:val="20"/>
+        </w:rPr>
+        <w:t xml:space="preserve">Conduct live hardware barcode and QR code scanning verification across Android handheld warehouse mobile terminals.</w:t>
       </w:r>
     </w:p>
     <w:p>
@@ -2873,7 +2841,7 @@
           <w:sz w:val="20"/>
           <w:szCs w:val="20"/>
         </w:rPr>
-        <w:t xml:space="preserve">The development sprint ending Saturday, 17 October 2026 achieved vital milestones across both enterprise software platforms. ZimMarket has ascended to top-tier e-commerce presentation standards with Amazon/Takealot product cards, Grid/List view switching, live dual-currency pricing, and a smooth touch-enabled hero carousel with studio-grade image scaling. Simultaneously, the IT Asset Management System established a complete bulk asset onboarding infrastructure with a standardized CSV template, 1-click download actions, and strict schema validation. Both systems have passed automated compilation and browser testing with 100% stability.</w:t>
+        <w:t xml:space="preserve">The development sprint ending Saturday, 24 October 2026 delivered critical architectural milestones across both enterprise software platforms. ZimMarket has established institutional-grade financial security with server-side price validation, cryptographic webhook authentication, atomic escrow reconciliation, and state-of-the-art discovery via the Global Search Omnibox and Merchant Storefront Profile view. Simultaneously, the IT Asset Management System gained an enterprise multi-facility branch management architecture with dedicated Branch Manager RBAC roles and department routing. Both applications are fully compiled, stable, and ready for production deployment.</w:t>
       </w:r>
     </w:p>
     <w:sectPr>

</xml_diff>